<commit_message>
Test summary 1.1 after re-test: 486 passed, six items closed; figures aligned across the package
</commit_message>
<xml_diff>
--- a/docs/package/out/BrokerVerse_Go_No_Go_and_Management_Register.docx
+++ b/docs/package/out/BrokerVerse_Go_No_Go_and_Management_Register.docx
@@ -789,7 +789,7 @@
             </w:rPr>
             <w:fldChar w:fldCharType="separate"/>
           </w:r>
-          <w:hyperlink w:anchor="__RefHeading___Toc2778_654585770">
+          <w:hyperlink w:anchor="__RefHeading___Toc2778_1904896951">
             <w:r>
               <w:rPr>
                 <w:webHidden/>
@@ -824,7 +824,7 @@
             </w:tabs>
             <w:rPr/>
           </w:pPr>
-          <w:hyperlink w:anchor="__RefHeading___Toc2780_654585770">
+          <w:hyperlink w:anchor="__RefHeading___Toc2780_1904896951">
             <w:r>
               <w:rPr>
                 <w:webHidden/>
@@ -853,7 +853,7 @@
             </w:tabs>
             <w:rPr/>
           </w:pPr>
-          <w:hyperlink w:anchor="__RefHeading___Toc2782_654585770">
+          <w:hyperlink w:anchor="__RefHeading___Toc2782_1904896951">
             <w:r>
               <w:rPr>
                 <w:webHidden/>
@@ -875,7 +875,7 @@
             </w:tabs>
             <w:rPr/>
           </w:pPr>
-          <w:hyperlink w:anchor="__RefHeading___Toc2784_654585770">
+          <w:hyperlink w:anchor="__RefHeading___Toc2784_1904896951">
             <w:r>
               <w:rPr>
                 <w:webHidden/>
@@ -897,7 +897,7 @@
             </w:tabs>
             <w:rPr/>
           </w:pPr>
-          <w:hyperlink w:anchor="__RefHeading___Toc2786_654585770">
+          <w:hyperlink w:anchor="__RefHeading___Toc2786_1904896951">
             <w:r>
               <w:rPr>
                 <w:webHidden/>
@@ -919,7 +919,7 @@
             </w:tabs>
             <w:rPr/>
           </w:pPr>
-          <w:hyperlink w:anchor="__RefHeading___Toc2788_654585770">
+          <w:hyperlink w:anchor="__RefHeading___Toc2788_1904896951">
             <w:r>
               <w:rPr>
                 <w:webHidden/>
@@ -941,7 +941,7 @@
             </w:tabs>
             <w:rPr/>
           </w:pPr>
-          <w:hyperlink w:anchor="__RefHeading___Toc2790_654585770">
+          <w:hyperlink w:anchor="__RefHeading___Toc2790_1904896951">
             <w:r>
               <w:rPr>
                 <w:webHidden/>
@@ -963,7 +963,7 @@
             </w:tabs>
             <w:rPr/>
           </w:pPr>
-          <w:hyperlink w:anchor="__RefHeading___Toc2792_654585770">
+          <w:hyperlink w:anchor="__RefHeading___Toc2792_1904896951">
             <w:r>
               <w:rPr>
                 <w:webHidden/>
@@ -985,7 +985,7 @@
             </w:tabs>
             <w:rPr/>
           </w:pPr>
-          <w:hyperlink w:anchor="__RefHeading___Toc2794_654585770">
+          <w:hyperlink w:anchor="__RefHeading___Toc2794_1904896951">
             <w:r>
               <w:rPr>
                 <w:webHidden/>
@@ -1007,7 +1007,7 @@
             </w:tabs>
             <w:rPr/>
           </w:pPr>
-          <w:hyperlink w:anchor="__RefHeading___Toc2796_654585770">
+          <w:hyperlink w:anchor="__RefHeading___Toc2796_1904896951">
             <w:r>
               <w:rPr>
                 <w:webHidden/>
@@ -1029,7 +1029,7 @@
             </w:tabs>
             <w:rPr/>
           </w:pPr>
-          <w:hyperlink w:anchor="__RefHeading___Toc2798_654585770">
+          <w:hyperlink w:anchor="__RefHeading___Toc2798_1904896951">
             <w:r>
               <w:rPr>
                 <w:webHidden/>
@@ -1051,7 +1051,7 @@
             </w:tabs>
             <w:rPr/>
           </w:pPr>
-          <w:hyperlink w:anchor="__RefHeading___Toc2800_654585770">
+          <w:hyperlink w:anchor="__RefHeading___Toc2800_1904896951">
             <w:r>
               <w:rPr>
                 <w:webHidden/>
@@ -1073,7 +1073,7 @@
             </w:tabs>
             <w:rPr/>
           </w:pPr>
-          <w:hyperlink w:anchor="__RefHeading___Toc2802_654585770">
+          <w:hyperlink w:anchor="__RefHeading___Toc2802_1904896951">
             <w:r>
               <w:rPr>
                 <w:webHidden/>
@@ -1121,7 +1121,7 @@
       <w:r>
         <w:br w:type="page"/>
       </w:r>
-      <w:bookmarkStart w:id="0" w:name="__RefHeading___Toc2778_654585770"/>
+      <w:bookmarkStart w:id="0" w:name="__RefHeading___Toc2778_1904896951"/>
       <w:bookmarkStart w:id="1" w:name="_Toc48319687"/>
       <w:bookmarkStart w:id="2" w:name="_Toc11824118"/>
       <w:bookmarkEnd w:id="0"/>
@@ -1764,7 +1764,7 @@
           <w:spacing w:val="0"/>
         </w:rPr>
       </w:pPr>
-      <w:bookmarkStart w:id="4" w:name="__RefHeading___Toc2780_654585770"/>
+      <w:bookmarkStart w:id="4" w:name="__RefHeading___Toc2780_1904896951"/>
       <w:bookmarkStart w:id="5" w:name="_Toc233203388"/>
       <w:bookmarkEnd w:id="4"/>
       <w:r>
@@ -3227,7 +3227,7 @@
         <w:pageBreakBefore w:val="false"/>
         <w:rPr/>
       </w:pPr>
-      <w:bookmarkStart w:id="6" w:name="__RefHeading___Toc2782_654585770"/>
+      <w:bookmarkStart w:id="6" w:name="__RefHeading___Toc2782_1904896951"/>
       <w:bookmarkEnd w:id="6"/>
       <w:r>
         <w:rPr>
@@ -3372,7 +3372,7 @@
         <w:pStyle w:val="Heading1"/>
         <w:rPr/>
       </w:pPr>
-      <w:bookmarkStart w:id="7" w:name="__RefHeading___Toc2784_654585770"/>
+      <w:bookmarkStart w:id="7" w:name="__RefHeading___Toc2784_1904896951"/>
       <w:bookmarkEnd w:id="7"/>
       <w:r>
         <w:rPr>
@@ -4731,7 +4731,7 @@
       <w:r>
         <w:br w:type="page"/>
       </w:r>
-      <w:bookmarkStart w:id="8" w:name="__RefHeading___Toc2786_654585770"/>
+      <w:bookmarkStart w:id="8" w:name="__RefHeading___Toc2786_1904896951"/>
       <w:bookmarkEnd w:id="8"/>
       <w:r>
         <w:rPr>
@@ -5547,7 +5547,7 @@
       <w:r>
         <w:br w:type="page"/>
       </w:r>
-      <w:bookmarkStart w:id="9" w:name="__RefHeading___Toc2788_654585770"/>
+      <w:bookmarkStart w:id="9" w:name="__RefHeading___Toc2788_1904896951"/>
       <w:bookmarkEnd w:id="9"/>
       <w:r>
         <w:rPr>
@@ -5715,7 +5715,7 @@
         <w:pStyle w:val="Heading1"/>
         <w:rPr/>
       </w:pPr>
-      <w:bookmarkStart w:id="10" w:name="__RefHeading___Toc2790_654585770"/>
+      <w:bookmarkStart w:id="10" w:name="__RefHeading___Toc2790_1904896951"/>
       <w:bookmarkEnd w:id="10"/>
       <w:r>
         <w:rPr>
@@ -6904,7 +6904,7 @@
       <w:r>
         <w:br w:type="page"/>
       </w:r>
-      <w:bookmarkStart w:id="11" w:name="__RefHeading___Toc2792_654585770"/>
+      <w:bookmarkStart w:id="11" w:name="__RefHeading___Toc2792_1904896951"/>
       <w:bookmarkEnd w:id="11"/>
       <w:r>
         <w:rPr>
@@ -7185,7 +7185,7 @@
                 <w:szCs w:val="24"/>
                 <w:lang w:val="en-US" w:eastAsia="ja-JP" w:bidi="ar-SA"/>
               </w:rPr>
-              <w:t>Fill the [to confirm] facts: 33 in the continuity plan, 30 in the security questionnaire, 5 in the release notes, 5 in the sales FAQ, 3 in the battlecard</w:t>
+              <w:t>Fill the [to confirm] facts: 33 in the continuity plan, 28 in the security questionnaire, 4 in the release notes, 5 in the sales FAQ, 3 in the battlecard</w:t>
             </w:r>
           </w:p>
         </w:tc>
@@ -7877,7 +7877,7 @@
       <w:r>
         <w:br w:type="page"/>
       </w:r>
-      <w:bookmarkStart w:id="12" w:name="__RefHeading___Toc2794_654585770"/>
+      <w:bookmarkStart w:id="12" w:name="__RefHeading___Toc2794_1904896951"/>
       <w:bookmarkEnd w:id="12"/>
       <w:r>
         <w:rPr>
@@ -8952,7 +8952,7 @@
       <w:r>
         <w:br w:type="page"/>
       </w:r>
-      <w:bookmarkStart w:id="13" w:name="__RefHeading___Toc2796_654585770"/>
+      <w:bookmarkStart w:id="13" w:name="__RefHeading___Toc2796_1904896951"/>
       <w:bookmarkEnd w:id="13"/>
       <w:r>
         <w:rPr>
@@ -11950,7 +11950,7 @@
       <w:r>
         <w:br w:type="page"/>
       </w:r>
-      <w:bookmarkStart w:id="14" w:name="__RefHeading___Toc2798_654585770"/>
+      <w:bookmarkStart w:id="14" w:name="__RefHeading___Toc2798_1904896951"/>
       <w:bookmarkEnd w:id="14"/>
       <w:r>
         <w:rPr>
@@ -14267,7 +14267,7 @@
       <w:r>
         <w:br w:type="page"/>
       </w:r>
-      <w:bookmarkStart w:id="15" w:name="__RefHeading___Toc2800_654585770"/>
+      <w:bookmarkStart w:id="15" w:name="__RefHeading___Toc2800_1904896951"/>
       <w:bookmarkEnd w:id="15"/>
       <w:r>
         <w:rPr>
@@ -15209,7 +15209,7 @@
       <w:r>
         <w:br w:type="page"/>
       </w:r>
-      <w:bookmarkStart w:id="16" w:name="__RefHeading___Toc2802_654585770"/>
+      <w:bookmarkStart w:id="16" w:name="__RefHeading___Toc2802_1904896951"/>
       <w:bookmarkStart w:id="17" w:name="_Toc233203395"/>
       <w:bookmarkEnd w:id="16"/>
       <w:r>

</xml_diff>